<commit_message>
fix(ijmr): report analytic n in state table, NaN-safe quintiles, non-destructive frame
Addresses final-review findings on the IJMR extension scripts: state ranking
now reports the post-dropna analytic n (synced into supplementary S3, 11 states);
weighted_quintiles excludes missing rows before cut-points; consumption-quintile
section no longer narrows the 60+ frame used by the projection base and caregiving
sensitivity; removed dead code. All percentages, quintiles and projections
unchanged.

Co-Authored-By: Claude Opus 4.8 <noreply@anthropic.com>
</commit_message>
<xml_diff>
--- a/india-ageing-atlas/submission_assets/IJMR_HEALTH_ECONOMICS_ELDERLY_2026-06-26/supplementary_IJMR.docx
+++ b/india-ageing-atlas/submission_assets/IJMR_HEALTH_ECONOMICS_ELDERLY_2026-06-26/supplementary_IJMR.docx
@@ -557,7 +557,7 @@
               <w:jc w:val="right"/>
             </w:pPr>
             <w:r>
-              <w:t xml:space="preserve">1536</w:t>
+              <w:t xml:space="preserve">1533</w:t>
             </w:r>
           </w:p>
         </w:tc>
@@ -857,7 +857,7 @@
               <w:jc w:val="right"/>
             </w:pPr>
             <w:r>
-              <w:t xml:space="preserve">1002</w:t>
+              <w:t xml:space="preserve">1001</w:t>
             </w:r>
           </w:p>
         </w:tc>
@@ -1107,7 +1107,7 @@
               <w:jc w:val="right"/>
             </w:pPr>
             <w:r>
-              <w:t xml:space="preserve">1100</w:t>
+              <w:t xml:space="preserve">1099</w:t>
             </w:r>
           </w:p>
         </w:tc>
@@ -1357,7 +1357,7 @@
               <w:jc w:val="right"/>
             </w:pPr>
             <w:r>
-              <w:t xml:space="preserve">1074</w:t>
+              <w:t xml:space="preserve">1071</w:t>
             </w:r>
           </w:p>
         </w:tc>
@@ -1507,7 +1507,7 @@
               <w:jc w:val="right"/>
             </w:pPr>
             <w:r>
-              <w:t xml:space="preserve">1533</w:t>
+              <w:t xml:space="preserve">1523</w:t>
             </w:r>
           </w:p>
         </w:tc>
@@ -1557,7 +1557,7 @@
               <w:jc w:val="right"/>
             </w:pPr>
             <w:r>
-              <w:t xml:space="preserve">493</w:t>
+              <w:t xml:space="preserve">492</w:t>
             </w:r>
           </w:p>
         </w:tc>
@@ -1807,7 +1807,7 @@
               <w:jc w:val="right"/>
             </w:pPr>
             <w:r>
-              <w:t xml:space="preserve">639</w:t>
+              <w:t xml:space="preserve">638</w:t>
             </w:r>
           </w:p>
         </w:tc>
@@ -1957,7 +1957,7 @@
               <w:jc w:val="right"/>
             </w:pPr>
             <w:r>
-              <w:t xml:space="preserve">992</w:t>
+              <w:t xml:space="preserve">989</w:t>
             </w:r>
           </w:p>
         </w:tc>
@@ -2007,7 +2007,7 @@
               <w:jc w:val="right"/>
             </w:pPr>
             <w:r>
-              <w:t xml:space="preserve">779</w:t>
+              <w:t xml:space="preserve">778</w:t>
             </w:r>
           </w:p>
         </w:tc>
@@ -2057,7 +2057,7 @@
               <w:jc w:val="right"/>
             </w:pPr>
             <w:r>
-              <w:t xml:space="preserve">601</w:t>
+              <w:t xml:space="preserve">599</w:t>
             </w:r>
           </w:p>
         </w:tc>
@@ -2157,7 +2157,7 @@
               <w:jc w:val="right"/>
             </w:pPr>
             <w:r>
-              <w:t xml:space="preserve">433</w:t>
+              <w:t xml:space="preserve">431</w:t>
             </w:r>
           </w:p>
         </w:tc>

</xml_diff>